<commit_message>
docs: cap nhat HANDOFF - day du tinh nang moi T6/2026
</commit_message>
<xml_diff>
--- a/HANDOFF.docx
+++ b/HANDOFF.docx
@@ -12,23 +12,9 @@
           <w:rFonts w:ascii="Arial" w:hAnsi="Arial"/>
           <w:b/>
           <w:color w:val="1E3A5F"/>
-          <w:sz w:val="56"/>
+          <w:sz w:val="52"/>
         </w:rPr>
-        <w:t>HANDOFF</w:t>
-      </w:r>
-    </w:p>
-    <w:p>
-      <w:pPr>
-        <w:jc w:val="center"/>
-      </w:pPr>
-      <w:r>
-        <w:rPr>
-          <w:rFonts w:ascii="Arial" w:hAnsi="Arial"/>
-          <w:b/>
-          <w:color w:val="2D6A9F"/>
-          <w:sz w:val="40"/>
-        </w:rPr>
-        <w:t>KPI OTC DASHBOARD</w:t>
+        <w:t>HANDOFF — KPI OTC DASHBOARD</w:t>
       </w:r>
     </w:p>
     <w:p>
@@ -42,7 +28,7 @@
           <w:color w:val="888888"/>
           <w:sz w:val="24"/>
         </w:rPr>
-        <w:t>Tài liệu bàn giao dự án</w:t>
+        <w:t>Tài liệu bàn giao dự án · Tháng 6/2026</w:t>
       </w:r>
     </w:p>
     <w:p/>
@@ -53,10 +39,10 @@
       <w:r>
         <w:rPr>
           <w:rFonts w:ascii="Arial" w:hAnsi="Arial"/>
-          <w:color w:val="888888"/>
+          <w:color w:val="2D6A9F"/>
           <w:sz w:val="20"/>
         </w:rPr>
-        <w:t>Tháng 6/2026  |  Claude Code (AI Assistant)</w:t>
+        <w:t>GitHub: https://github.com/namlhwork84/kpi-otc-dashboard</w:t>
       </w:r>
     </w:p>
     <w:p>
@@ -89,9 +75,8 @@
         <w:rPr>
           <w:rFonts w:ascii="Arial" w:hAnsi="Arial"/>
           <w:b w:val="0"/>
-          <w:i w:val="0"/>
         </w:rPr>
-        <w:t>Dự án xây dựng Web Dashboard theo dõi KPI Kênh OTC, hiển thị và so sánh chỉ tiêu mục tiêu với doanh số thực hiện theo từng cấp Kênh / DSM / TDV / CTV.</w:t>
+        <w:t>Web Dashboard theo dõi KPI Kênh OTC — hiển thị và so sánh chỉ tiêu mục tiêu với doanh số thực hiện theo từng cấp Kênh / DSM / TDV / CTV.</w:t>
       </w:r>
     </w:p>
     <w:p/>
@@ -484,7 +469,7 @@
           <w:color w:val="2E7D32"/>
           <w:sz w:val="18"/>
         </w:rPr>
-        <w:t>│   ├── parser.js       ← Đọc &amp; parse file Excel</w:t>
+        <w:t>│   ├── parser.js       ← Đọc &amp; parse file Excel (12 tháng)</w:t>
       </w:r>
     </w:p>
     <w:p>
@@ -512,7 +497,7 @@
           <w:color w:val="2E7D32"/>
           <w:sz w:val="18"/>
         </w:rPr>
-        <w:t>│   ├── data.json       ← Database (tự tạo khi chạy lần đầu)</w:t>
+        <w:t>│   ├── data.json       ← Database local (2664 chi_tieu records)</w:t>
       </w:r>
     </w:p>
     <w:p>
@@ -568,7 +553,7 @@
           <w:color w:val="2E7D32"/>
           <w:sz w:val="18"/>
         </w:rPr>
-        <w:t xml:space="preserve">        ├── App.jsx              ← Layout chính, menu sidebar</w:t>
+        <w:t xml:space="preserve">        ├── App.jsx              ← Layout + menu sidebar</w:t>
       </w:r>
     </w:p>
     <w:p>
@@ -610,7 +595,7 @@
           <w:color w:val="2E7D32"/>
           <w:sz w:val="18"/>
         </w:rPr>
-        <w:t xml:space="preserve">        │   ├── Dashboard.jsx    ← Trang chính KPI</w:t>
+        <w:t xml:space="preserve">        │   ├── Dashboard.jsx    ← KPI cards + biểu đồ</w:t>
       </w:r>
     </w:p>
     <w:p>
@@ -708,9 +693,8 @@
         <w:rPr>
           <w:rFonts w:ascii="Arial" w:hAnsi="Arial"/>
           <w:b/>
-          <w:i w:val="0"/>
         </w:rPr>
-        <w:t>Bắt buộc phải cài trước khi chạy:</w:t>
+        <w:t>Bắt buộc cài trước khi chạy:</w:t>
       </w:r>
     </w:p>
     <w:p>
@@ -738,7 +722,7 @@
           <w:rFonts w:ascii="Arial" w:hAnsi="Arial"/>
           <w:sz w:val="20"/>
         </w:rPr>
-        <w:t>npm (đi kèm Node.js, không cần cài thêm)</w:t>
+        <w:t>npm (đi kèm Node.js)</w:t>
       </w:r>
     </w:p>
     <w:p/>
@@ -750,9 +734,8 @@
         <w:rPr>
           <w:rFonts w:ascii="Arial" w:hAnsi="Arial"/>
           <w:b/>
-          <w:i w:val="0"/>
         </w:rPr>
-        <w:t>Kiểm tra bằng lệnh:</w:t>
+        <w:t>Kiểm tra:</w:t>
       </w:r>
     </w:p>
     <w:p>
@@ -806,7 +789,7 @@
         <w:spacing w:before="200" w:after="40"/>
       </w:pPr>
       <w:r>
-        <w:t>Bước 1 — Cài dependencies Backend</w:t>
+        <w:t>Bước 1 — Clone từ GitHub</w:t>
       </w:r>
     </w:p>
     <w:p>
@@ -820,7 +803,44 @@
           <w:color w:val="2E7D32"/>
           <w:sz w:val="18"/>
         </w:rPr>
-        <w:t>cd "KPI OTC/backend"</w:t>
+        <w:t>git clone https://github.com/namlhwork84/kpi-otc-dashboard.git</w:t>
+      </w:r>
+    </w:p>
+    <w:p>
+      <w:pPr>
+        <w:spacing w:after="40"/>
+        <w:ind w:left="454"/>
+      </w:pPr>
+      <w:r>
+        <w:rPr>
+          <w:rFonts w:ascii="Courier New" w:hAnsi="Courier New"/>
+          <w:color w:val="2E7D32"/>
+          <w:sz w:val="18"/>
+        </w:rPr>
+        <w:t>cd kpi-otc-dashboard</w:t>
+      </w:r>
+    </w:p>
+    <w:p>
+      <w:pPr>
+        <w:pStyle w:val="Heading2"/>
+        <w:spacing w:before="200" w:after="40"/>
+      </w:pPr>
+      <w:r>
+        <w:t>Bước 2 — Cài Backend</w:t>
+      </w:r>
+    </w:p>
+    <w:p>
+      <w:pPr>
+        <w:spacing w:after="40"/>
+        <w:ind w:left="454"/>
+      </w:pPr>
+      <w:r>
+        <w:rPr>
+          <w:rFonts w:ascii="Courier New" w:hAnsi="Courier New"/>
+          <w:color w:val="2E7D32"/>
+          <w:sz w:val="18"/>
+        </w:rPr>
+        <w:t>cd backend</w:t>
       </w:r>
     </w:p>
     <w:p>
@@ -843,7 +863,7 @@
         <w:spacing w:before="200" w:after="40"/>
       </w:pPr>
       <w:r>
-        <w:t>Bước 2 — Cài dependencies Frontend</w:t>
+        <w:t>Bước 3 — Cài Frontend</w:t>
       </w:r>
     </w:p>
     <w:p>
@@ -857,7 +877,7 @@
           <w:color w:val="2E7D32"/>
           <w:sz w:val="18"/>
         </w:rPr>
-        <w:t>cd "KPI OTC/frontend"</w:t>
+        <w:t>cd ../frontend</w:t>
       </w:r>
     </w:p>
     <w:p>
@@ -880,7 +900,7 @@
         <w:spacing w:before="200" w:after="40"/>
       </w:pPr>
       <w:r>
-        <w:t>Bước 3 — Chạy Backend (Terminal 1)</w:t>
+        <w:t>Bước 4 — Chạy Backend (Terminal 1)</w:t>
       </w:r>
     </w:p>
     <w:p>
@@ -931,7 +951,7 @@
         <w:spacing w:before="200" w:after="40"/>
       </w:pPr>
       <w:r>
-        <w:t>Bước 4 — Chạy Frontend (Terminal 2)</w:t>
+        <w:t>Bước 5 — Chạy Frontend (Terminal 2)</w:t>
       </w:r>
     </w:p>
     <w:p>
@@ -973,7 +993,7 @@
           <w:color w:val="2E7D32"/>
           <w:sz w:val="18"/>
         </w:rPr>
-        <w:t>→ Kết quả: Local:   http://localhost:5173</w:t>
+        <w:t>→ Kết quả: Local: http://localhost:5173</w:t>
       </w:r>
     </w:p>
     <w:p>
@@ -982,7 +1002,7 @@
         <w:spacing w:before="200" w:after="40"/>
       </w:pPr>
       <w:r>
-        <w:t>Bước 5 — Mở trình duyệt</w:t>
+        <w:t>Bước 6 — Mở trình duyệt</w:t>
       </w:r>
     </w:p>
     <w:p>
@@ -996,7 +1016,7 @@
           <w:color w:val="2E7D32"/>
           <w:sz w:val="18"/>
         </w:rPr>
-        <w:t>http://localhost:5173</w:t>
+        <w:t>http://localhost:5173  →  Dashboard có sẵn dữ liệu T4/2026</w:t>
       </w:r>
     </w:p>
     <w:p>
@@ -1007,10 +1027,9 @@
         <w:rPr>
           <w:rFonts w:ascii="Arial" w:hAnsi="Arial"/>
           <w:b/>
-          <w:i w:val="0"/>
           <w:color w:val="C62828"/>
         </w:rPr>
-        <w:t>⚠️  Lưu ý: Terminal Backend và Terminal Frontend phải chạy đồng thời.</w:t>
+        <w:t>⚠️  Hai terminal Backend và Frontend phải chạy đồng thời.</w:t>
       </w:r>
     </w:p>
     <w:p>
@@ -1036,23 +1055,9 @@
         <w:spacing w:before="200" w:after="40"/>
       </w:pPr>
       <w:r>
-        <w:t>5.1  Upload dữ liệu (làm trước tiên)</w:t>
+        <w:t>5.1  Upload dữ liệu (trang Dữ liệu)</w:t>
       </w:r>
     </w:p>
-    <w:p>
-      <w:pPr>
-        <w:spacing w:after="80"/>
-      </w:pPr>
-      <w:r>
-        <w:rPr>
-          <w:rFonts w:ascii="Arial" w:hAnsi="Arial"/>
-          <w:b w:val="0"/>
-          <w:i w:val="0"/>
-        </w:rPr>
-        <w:t>Vào menu "Dữ liệu", upload theo thứ tự sau:</w:t>
-      </w:r>
-    </w:p>
-    <w:p/>
     <w:tbl>
       <w:tblPr>
         <w:tblStyle w:val="TableGrid"/>
@@ -1116,7 +1121,7 @@
                 <w:color w:val="FFFFFF"/>
                 <w:sz w:val="18"/>
               </w:rPr>
-              <w:t>Loại chọn</w:t>
+              <w:t>Loại upload</w:t>
             </w:r>
           </w:p>
         </w:tc>
@@ -1196,7 +1201,7 @@
                 <w:rFonts w:ascii="Arial" w:hAnsi="Arial"/>
                 <w:sz w:val="18"/>
               </w:rPr>
-              <w:t>Doanh số, Đơn hàng, Độ phủ, SPTT mục tiêu từng TDV/DSM</w:t>
+              <w:t>DS, Đơn hàng, Độ phủ, SPTT — tự parse đủ 12 tháng</w:t>
             </w:r>
           </w:p>
         </w:tc>
@@ -1262,7 +1267,7 @@
                 <w:rFonts w:ascii="Arial" w:hAnsi="Arial"/>
                 <w:sz w:val="18"/>
               </w:rPr>
-              <w:t>Doanh số, Đơn hàng, Số KH (phiên bản kế hoạch năm) — tùy chọn</w:t>
+              <w:t>DS, Đơn hàng, Số KH — phiên bản kế hoạch năm (tùy chọn)</w:t>
             </w:r>
           </w:p>
         </w:tc>
@@ -1337,7 +1342,7 @@
         <w:spacing w:before="200" w:after="40"/>
       </w:pPr>
       <w:r>
-        <w:t>5.2  Trang Dashboard</w:t>
+        <w:t>5.2  Dashboard (trang chính)</w:t>
       </w:r>
     </w:p>
     <w:p>
@@ -1351,7 +1356,7 @@
           <w:rFonts w:ascii="Arial" w:hAnsi="Arial"/>
           <w:sz w:val="20"/>
         </w:rPr>
-        <w:t>Bộ lọc: Năm / Quý / Tháng / Tuần / DSM / TDV — cascade từ trái sang phải</w:t>
+        <w:t>Bộ lọc: Năm / Quý / Tháng / Tuần / DSM / TDV — cascade trái sang phải</w:t>
       </w:r>
     </w:p>
     <w:p>
@@ -1365,7 +1370,7 @@
           <w:rFonts w:ascii="Arial" w:hAnsi="Arial"/>
           <w:sz w:val="20"/>
         </w:rPr>
-        <w:t>Tuần: tính từ Chủ Nhật (CN) đến Thứ Bảy (T7) trong tháng</w:t>
+        <w:t>Tuần tính từ Chủ Nhật (CN) đến Thứ Bảy (T7)</w:t>
       </w:r>
     </w:p>
     <w:p>
@@ -1379,7 +1384,7 @@
           <w:rFonts w:ascii="Arial" w:hAnsi="Arial"/>
           <w:sz w:val="20"/>
         </w:rPr>
-        <w:t>Tab "Theo DSM": biểu đồ cột + bảng tổng hợp theo từng DSM</w:t>
+        <w:t>Tab Theo DSM: biểu đồ cột Thực hiện vs Mục tiêu + bảng</w:t>
       </w:r>
     </w:p>
     <w:p>
@@ -1393,7 +1398,7 @@
           <w:rFonts w:ascii="Arial" w:hAnsi="Arial"/>
           <w:sz w:val="20"/>
         </w:rPr>
-        <w:t>Tab "Theo TDV/CTV": biểu đồ ngang + bảng chi tiết toàn bộ TDV</w:t>
+        <w:t>Tab Theo TDV/CTV: biểu đồ ngang + bảng đầy đủ</w:t>
       </w:r>
     </w:p>
     <w:p>
@@ -1402,7 +1407,7 @@
         <w:spacing w:before="200" w:after="40"/>
       </w:pPr>
       <w:r>
-        <w:t>5.3  Trang Mục Tiêu KPI</w:t>
+        <w:t>5.3  Mục Tiêu KPI (trang mới)</w:t>
       </w:r>
     </w:p>
     <w:p>
@@ -1416,7 +1421,7 @@
           <w:rFonts w:ascii="Arial" w:hAnsi="Arial"/>
           <w:sz w:val="20"/>
         </w:rPr>
-        <w:t>Bảng pivot tích hợp cả 2 file chỉ tiêu — 5 cột chỉ số trên 1 dòng/TDV</w:t>
+        <w:t>Bộ lọc: Năm | Tháng (Tháng 1–12 + Cả năm) | Khu vực (DSM) | Tìm kiếm TDV</w:t>
       </w:r>
     </w:p>
     <w:p>
@@ -1430,7 +1435,7 @@
           <w:rFonts w:ascii="Arial" w:hAnsi="Arial"/>
           <w:sz w:val="20"/>
         </w:rPr>
-        <w:t>Màu nền: đen = Tổng kênh, xanh nhạt = DSM, trắng = TDV/CTV</w:t>
+        <w:t>Cả năm → hiển thị chi_tieu_nam (chỉ tiêu cả năm), badge "Chỉ tiêu năm"</w:t>
       </w:r>
     </w:p>
     <w:p>
@@ -1444,7 +1449,7 @@
           <w:rFonts w:ascii="Arial" w:hAnsi="Arial"/>
           <w:sz w:val="20"/>
         </w:rPr>
-        <w:t>Bật nút "Chỉ tiêu năm" để xem thêm chỉ tiêu cả năm bên dưới</w:t>
+        <w:t>Khu vực → chọn DSM để lọc chỉ hiện DSM đó + TDV trực thuộc</w:t>
       </w:r>
     </w:p>
     <w:p>
@@ -1458,7 +1463,21 @@
           <w:rFonts w:ascii="Arial" w:hAnsi="Arial"/>
           <w:sz w:val="20"/>
         </w:rPr>
-        <w:t>Ô tìm kiếm: lọc nhanh theo tên TDV hoặc DSM</w:t>
+        <w:t>Phân cấp: TỔNG KÊNH (nền đen) → DSM (xanh, viền trái) → TDV (thụt lề)</w:t>
+      </w:r>
+    </w:p>
+    <w:p>
+      <w:pPr>
+        <w:pStyle w:val="ListBullet"/>
+        <w:spacing w:after="40"/>
+        <w:ind w:left="283"/>
+      </w:pPr>
+      <w:r>
+        <w:rPr>
+          <w:rFonts w:ascii="Arial" w:hAnsi="Arial"/>
+          <w:sz w:val="20"/>
+        </w:rPr>
+        <w:t>Nút "Chỉ tiêu năm": bật để xem thêm số cả năm bên dưới số tháng</w:t>
       </w:r>
     </w:p>
     <w:p>
@@ -1478,20 +1497,6 @@
         <w:spacing w:after="160"/>
       </w:pPr>
     </w:p>
-    <w:p>
-      <w:pPr>
-        <w:spacing w:after="80"/>
-      </w:pPr>
-      <w:r>
-        <w:rPr>
-          <w:rFonts w:ascii="Arial" w:hAnsi="Arial"/>
-          <w:b w:val="0"/>
-          <w:i w:val="0"/>
-        </w:rPr>
-        <w:t>Toàn bộ dữ liệu lưu trong file backend/data.json gồm 4 bảng:</w:t>
-      </w:r>
-    </w:p>
-    <w:p/>
     <w:tbl>
       <w:tblPr>
         <w:tblStyle w:val="TableGrid"/>
@@ -1524,7 +1529,7 @@
         </w:tc>
         <w:tc>
           <w:tcPr>
-            <w:tcW w:type="dxa" w:w="2551"/>
+            <w:tcW w:type="dxa" w:w="2268"/>
             <w:shd w:val="clear" w:color="auto" w:fill="1E3A5F"/>
           </w:tcPr>
           <w:p>
@@ -1542,7 +1547,7 @@
         </w:tc>
         <w:tc>
           <w:tcPr>
-            <w:tcW w:type="dxa" w:w="4819"/>
+            <w:tcW w:type="dxa" w:w="5102"/>
             <w:shd w:val="clear" w:color="auto" w:fill="1E3A5F"/>
           </w:tcPr>
           <w:p>
@@ -1577,7 +1582,7 @@
         </w:tc>
         <w:tc>
           <w:tcPr>
-            <w:tcW w:type="dxa" w:w="2551"/>
+            <w:tcW w:type="dxa" w:w="2268"/>
           </w:tcPr>
           <w:p>
             <w:r/>
@@ -1586,13 +1591,13 @@
                 <w:rFonts w:ascii="Arial" w:hAnsi="Arial"/>
                 <w:sz w:val="18"/>
               </w:rPr>
-              <w:t>Mục tiêu KPI theo tháng, từng TDV/DSM</w:t>
+              <w:t>Mục tiêu KPI 12 tháng, từng TDV/DSM</w:t>
             </w:r>
           </w:p>
         </w:tc>
         <w:tc>
           <w:tcPr>
-            <w:tcW w:type="dxa" w:w="4819"/>
+            <w:tcW w:type="dxa" w:w="5102"/>
           </w:tcPr>
           <w:p>
             <w:r/>
@@ -1601,7 +1606,7 @@
                 <w:rFonts w:ascii="Arial" w:hAnsi="Arial"/>
                 <w:sz w:val="18"/>
               </w:rPr>
-              <w:t>nam, thang, nhom, nhan_vien, chi_so, chi_tieu_nam, gia_tri, nguon</w:t>
+              <w:t>nam, thang, nhom, parent_dsm, nhan_vien, chi_so, chi_tieu_nam, gia_tri, nguon</w:t>
             </w:r>
           </w:p>
         </w:tc>
@@ -1625,7 +1630,7 @@
         </w:tc>
         <w:tc>
           <w:tcPr>
-            <w:tcW w:type="dxa" w:w="2551"/>
+            <w:tcW w:type="dxa" w:w="2268"/>
             <w:shd w:val="clear" w:color="auto" w:fill="E8F0FB"/>
           </w:tcPr>
           <w:p>
@@ -1635,13 +1640,13 @@
                 <w:rFonts w:ascii="Arial" w:hAnsi="Arial"/>
                 <w:sz w:val="18"/>
               </w:rPr>
-              <w:t>Giao dịch bán hàng thực tế theo ngày</w:t>
+              <w:t>Giao dịch bán hàng thực tế</w:t>
             </w:r>
           </w:p>
         </w:tc>
         <w:tc>
           <w:tcPr>
-            <w:tcW w:type="dxa" w:w="4819"/>
+            <w:tcW w:type="dxa" w:w="5102"/>
             <w:shd w:val="clear" w:color="auto" w:fill="E8F0FB"/>
           </w:tcPr>
           <w:p>
@@ -1674,7 +1679,7 @@
         </w:tc>
         <w:tc>
           <w:tcPr>
-            <w:tcW w:type="dxa" w:w="2551"/>
+            <w:tcW w:type="dxa" w:w="2268"/>
           </w:tcPr>
           <w:p>
             <w:r/>
@@ -1689,7 +1694,7 @@
         </w:tc>
         <w:tc>
           <w:tcPr>
-            <w:tcW w:type="dxa" w:w="4819"/>
+            <w:tcW w:type="dxa" w:w="5102"/>
           </w:tcPr>
           <w:p>
             <w:r/>
@@ -1722,7 +1727,7 @@
         </w:tc>
         <w:tc>
           <w:tcPr>
-            <w:tcW w:type="dxa" w:w="2551"/>
+            <w:tcW w:type="dxa" w:w="2268"/>
             <w:shd w:val="clear" w:color="auto" w:fill="E8F0FB"/>
           </w:tcPr>
           <w:p>
@@ -1732,13 +1737,13 @@
                 <w:rFonts w:ascii="Arial" w:hAnsi="Arial"/>
                 <w:sz w:val="18"/>
               </w:rPr>
-              <w:t>Tài khoản (dự phòng cho login sau)</w:t>
+              <w:t>Tài khoản (dự phòng)</w:t>
             </w:r>
           </w:p>
         </w:tc>
         <w:tc>
           <w:tcPr>
-            <w:tcW w:type="dxa" w:w="4819"/>
+            <w:tcW w:type="dxa" w:w="5102"/>
             <w:shd w:val="clear" w:color="auto" w:fill="E8F0FB"/>
           </w:tcPr>
           <w:p>
@@ -1762,38 +1767,9 @@
       <w:r>
         <w:rPr>
           <w:rFonts w:ascii="Arial" w:hAnsi="Arial"/>
-          <w:b/>
-          <w:i w:val="0"/>
+          <w:b w:val="0"/>
         </w:rPr>
-        <w:t>Trường nguon trong chi_tieu:</w:t>
-      </w:r>
-    </w:p>
-    <w:p>
-      <w:pPr>
-        <w:pStyle w:val="ListBullet"/>
-        <w:spacing w:after="40"/>
-        <w:ind w:left="283"/>
-      </w:pPr>
-      <w:r>
-        <w:rPr>
-          <w:rFonts w:ascii="Arial" w:hAnsi="Arial"/>
-          <w:sz w:val="20"/>
-        </w:rPr>
-        <w:t>'sptt'     — từ file CHỈ TIÊU SPTT.xlsx</w:t>
-      </w:r>
-    </w:p>
-    <w:p>
-      <w:pPr>
-        <w:pStyle w:val="ListBullet"/>
-        <w:spacing w:after="40"/>
-        <w:ind w:left="283"/>
-      </w:pPr>
-      <w:r>
-        <w:rPr>
-          <w:rFonts w:ascii="Arial" w:hAnsi="Arial"/>
-          <w:sz w:val="20"/>
-        </w:rPr>
-        <w:t>'ke_hoach' — từ file CHỈ TIÊU KẾ HOẠCH.xlsx</w:t>
+        <w:t>parent_dsm: DSM cha của từng TDV (null = cấp tổng/DSM). Dùng để hiển thị phân cấp trong bảng Mục Tiêu.</w:t>
       </w:r>
     </w:p>
     <w:p>
@@ -1922,7 +1898,7 @@
                 <w:rFonts w:ascii="Arial" w:hAnsi="Arial"/>
                 <w:sz w:val="18"/>
               </w:rPr>
-              <w:t>Upload file chỉ tiêu (param: nguon=sptt|ke_hoach, nam, thang)</w:t>
+              <w:t>Upload chỉ tiêu — parse đủ 12 tháng (param: nguon=sptt|ke_hoach)</w:t>
             </w:r>
           </w:p>
         </w:tc>
@@ -1972,7 +1948,7 @@
                 <w:rFonts w:ascii="Arial" w:hAnsi="Arial"/>
                 <w:sz w:val="18"/>
               </w:rPr>
-              <w:t>Upload file doanh số thực hiện</w:t>
+              <w:t>Upload doanh số thực hiện</w:t>
             </w:r>
           </w:p>
         </w:tc>
@@ -2019,7 +1995,7 @@
                 <w:rFonts w:ascii="Arial" w:hAnsi="Arial"/>
                 <w:sz w:val="18"/>
               </w:rPr>
-              <w:t>KPI cards: DS thực hiện, mục tiêu, % HT</w:t>
+              <w:t>KPI cards: DS, Đơn hàng, Độ phủ, SPTT</w:t>
             </w:r>
           </w:p>
         </w:tc>
@@ -2069,7 +2045,7 @@
                 <w:rFonts w:ascii="Arial" w:hAnsi="Arial"/>
                 <w:sz w:val="18"/>
               </w:rPr>
-              <w:t>Breakdown doanh số theo từng DSM</w:t>
+              <w:t>Breakdown theo DSM</w:t>
             </w:r>
           </w:p>
         </w:tc>
@@ -2116,7 +2092,7 @@
                 <w:rFonts w:ascii="Arial" w:hAnsi="Arial"/>
                 <w:sz w:val="18"/>
               </w:rPr>
-              <w:t>Breakdown doanh số theo từng TDV</w:t>
+              <w:t>Breakdown theo TDV</w:t>
             </w:r>
           </w:p>
         </w:tc>
@@ -2166,7 +2142,7 @@
                 <w:rFonts w:ascii="Arial" w:hAnsi="Arial"/>
                 <w:sz w:val="18"/>
               </w:rPr>
-              <w:t>Doanh số theo 5 tuần trong tháng</w:t>
+              <w:t>DS theo 5 tuần trong tháng</w:t>
             </w:r>
           </w:p>
         </w:tc>
@@ -2213,7 +2189,7 @@
                 <w:rFonts w:ascii="Arial" w:hAnsi="Arial"/>
                 <w:sz w:val="18"/>
               </w:rPr>
-              <w:t>Bảng pivot tất cả chỉ tiêu mục tiêu</w:t>
+              <w:t>Pivot mục tiêu — thang=0 trả về chi_tieu_nam</w:t>
             </w:r>
           </w:p>
         </w:tc>
@@ -2263,7 +2239,7 @@
                 <w:rFonts w:ascii="Arial" w:hAnsi="Arial"/>
                 <w:sz w:val="18"/>
               </w:rPr>
-              <w:t>Danh sách DSM (cho dropdown filter)</w:t>
+              <w:t>Danh sách DSM (dropdown)</w:t>
             </w:r>
           </w:p>
         </w:tc>
@@ -2310,7 +2286,7 @@
                 <w:rFonts w:ascii="Arial" w:hAnsi="Arial"/>
                 <w:sz w:val="18"/>
               </w:rPr>
-              <w:t>Danh sách TDV theo DSM đã chọn</w:t>
+              <w:t>Danh sách TDV theo DSM</w:t>
             </w:r>
           </w:p>
         </w:tc>
@@ -2325,9 +2301,8 @@
         <w:rPr>
           <w:rFonts w:ascii="Arial" w:hAnsi="Arial"/>
           <w:b w:val="0"/>
-          <w:i w:val="0"/>
         </w:rPr>
-        <w:t>Query params chung: nam, thang, dsm, tdv, tuan</w:t>
+        <w:t>Query params: nam, thang (0=cả năm), dsm, tdv, tuan</w:t>
       </w:r>
     </w:p>
     <w:p>
@@ -2353,7 +2328,7 @@
         <w:spacing w:before="200" w:after="40"/>
       </w:pPr>
       <w:r>
-        <w:t>8.1  Tính tuần trong tháng</w:t>
+        <w:t>8.1  Upload chỉ tiêu → parse 12 tháng cùng lúc</w:t>
       </w:r>
     </w:p>
     <w:p>
@@ -2364,9 +2339,41 @@
         <w:rPr>
           <w:rFonts w:ascii="Arial" w:hAnsi="Arial"/>
           <w:b w:val="0"/>
-          <w:i w:val="0"/>
         </w:rPr>
-        <w:t>Mỗi tuần bắt đầu từ Chủ Nhật (CN), kết thúc Thứ Bảy (T7). Tuần 1 bắt đầu từ ngày 1 tháng đó.</w:t>
+        <w:t>Khi upload 1 file, hệ thống tự parse tất cả 12 tháng và xóa toàn bộ năm cũ cùng nguồn trước khi lưu.</w:t>
+      </w:r>
+    </w:p>
+    <w:p>
+      <w:pPr>
+        <w:spacing w:after="80"/>
+      </w:pPr>
+      <w:r>
+        <w:rPr>
+          <w:rFonts w:ascii="Arial" w:hAnsi="Arial"/>
+          <w:b w:val="0"/>
+        </w:rPr>
+        <w:t>Kết quả: 2.664 records (222 TDV/DSM × 12 tháng) cho file T4/2026.</w:t>
+      </w:r>
+    </w:p>
+    <w:p>
+      <w:pPr>
+        <w:pStyle w:val="Heading2"/>
+        <w:spacing w:before="200" w:after="40"/>
+      </w:pPr>
+      <w:r>
+        <w:t>8.2  Tuần trong tháng</w:t>
+      </w:r>
+    </w:p>
+    <w:p>
+      <w:pPr>
+        <w:spacing w:after="80"/>
+      </w:pPr>
+      <w:r>
+        <w:rPr>
+          <w:rFonts w:ascii="Arial" w:hAnsi="Arial"/>
+          <w:b w:val="0"/>
+        </w:rPr>
+        <w:t>Mỗi tuần: CN→T7. Công thức:</w:t>
       </w:r>
     </w:p>
     <w:p>
@@ -2389,20 +2396,7 @@
         <w:spacing w:before="200" w:after="40"/>
       </w:pPr>
       <w:r>
-        <w:t>8.2  Mục tiêu theo cấp — tránh double-count</w:t>
-      </w:r>
-    </w:p>
-    <w:p>
-      <w:pPr>
-        <w:spacing w:after="80"/>
-      </w:pPr>
-      <w:r>
-        <w:rPr>
-          <w:rFonts w:ascii="Arial" w:hAnsi="Arial"/>
-          <w:b w:val="0"/>
-          <w:i w:val="0"/>
-        </w:rPr>
-        <w:t>Khi hiển thị KPI cards, chỉ lấy mục tiêu của đúng cấp đang xem:</w:t>
+        <w:t>8.3  Mục tiêu theo cấp — tránh double-count</w:t>
       </w:r>
     </w:p>
     <w:p>
@@ -2416,7 +2410,7 @@
           <w:rFonts w:ascii="Arial" w:hAnsi="Arial"/>
           <w:sz w:val="20"/>
         </w:rPr>
-        <w:t>Toàn kênh  →  nhan_vien = "TỔNG KÊNH"</w:t>
+        <w:t>Toàn kênh → nhan_vien = "TỔNG KÊNH"</w:t>
       </w:r>
     </w:p>
     <w:p>
@@ -2430,7 +2424,7 @@
           <w:rFonts w:ascii="Arial" w:hAnsi="Arial"/>
           <w:sz w:val="20"/>
         </w:rPr>
-        <w:t>Theo DSM   →  nhan_vien = "DSM 01" / "DSM 02" / ...</w:t>
+        <w:t>Theo DSM → nhan_vien = "DSM 01" / "DSM 02" / ...</w:t>
       </w:r>
     </w:p>
     <w:p>
@@ -2444,21 +2438,7 @@
           <w:rFonts w:ascii="Arial" w:hAnsi="Arial"/>
           <w:sz w:val="20"/>
         </w:rPr>
-        <w:t>Theo TDV   →  nhan_vien = tên TDV cụ thể</w:t>
-      </w:r>
-    </w:p>
-    <w:p>
-      <w:pPr>
-        <w:pStyle w:val="ListBullet"/>
-        <w:spacing w:after="40"/>
-        <w:ind w:left="283"/>
-      </w:pPr>
-      <w:r>
-        <w:rPr>
-          <w:rFonts w:ascii="Arial" w:hAnsi="Arial"/>
-          <w:sz w:val="20"/>
-        </w:rPr>
-        <w:t>Không cộng dồn nhiều cấp (sẽ bị trùng số liệu)</w:t>
+        <w:t>Theo TDV → nhan_vien = tên TDV cụ thể</w:t>
       </w:r>
     </w:p>
     <w:p>
@@ -2467,20 +2447,7 @@
         <w:spacing w:before="200" w:after="40"/>
       </w:pPr>
       <w:r>
-        <w:t>8.3  Mapping DSM key</w:t>
-      </w:r>
-    </w:p>
-    <w:p>
-      <w:pPr>
-        <w:spacing w:after="80"/>
-      </w:pPr>
-      <w:r>
-        <w:rPr>
-          <w:rFonts w:ascii="Arial" w:hAnsi="Arial"/>
-          <w:b w:val="0"/>
-          <w:i w:val="0"/>
-        </w:rPr>
-        <w:t>Dữ liệu bán hàng và chỉ tiêu dùng format khác nhau:</w:t>
+        <w:t>8.4  Mapping DSM key</w:t>
       </w:r>
     </w:p>
     <w:tbl>
@@ -2799,20 +2766,7 @@
         <w:spacing w:before="200" w:after="40"/>
       </w:pPr>
       <w:r>
-        <w:t>8.4  Ưu tiên cột doanh số thực hiện</w:t>
-      </w:r>
-    </w:p>
-    <w:p>
-      <w:pPr>
-        <w:spacing w:after="80"/>
-      </w:pPr>
-      <w:r>
-        <w:rPr>
-          <w:rFonts w:ascii="Arial" w:hAnsi="Arial"/>
-          <w:b w:val="0"/>
-          <w:i w:val="0"/>
-        </w:rPr>
-        <w:t>Parser tự động chọn cột theo thứ tự:</w:t>
+        <w:t>8.5  Ưu tiên cột doanh số thực hiện</w:t>
       </w:r>
     </w:p>
     <w:p>
@@ -2826,35 +2780,7 @@
           <w:rFonts w:ascii="Arial" w:hAnsi="Arial"/>
           <w:sz w:val="20"/>
         </w:rPr>
-        <w:t>1. Doanh số thực đạt (nếu có — file export SPTT)</w:t>
-      </w:r>
-    </w:p>
-    <w:p>
-      <w:pPr>
-        <w:pStyle w:val="ListBullet"/>
-        <w:spacing w:after="40"/>
-        <w:ind w:left="283"/>
-      </w:pPr>
-      <w:r>
-        <w:rPr>
-          <w:rFonts w:ascii="Arial" w:hAnsi="Arial"/>
-          <w:sz w:val="20"/>
-        </w:rPr>
-        <w:t>2. Tổng thanh toán (file DSTT.OTC — bao gồm thuế GTGT)</w:t>
-      </w:r>
-    </w:p>
-    <w:p>
-      <w:pPr>
-        <w:pStyle w:val="ListBullet"/>
-        <w:spacing w:after="40"/>
-        <w:ind w:left="283"/>
-      </w:pPr>
-      <w:r>
-        <w:rPr>
-          <w:rFonts w:ascii="Arial" w:hAnsi="Arial"/>
-          <w:sz w:val="20"/>
-        </w:rPr>
-        <w:t>3. Doanh số bán (fallback)</w:t>
+        <w:t>1. Doanh số thực đạt (file SPTT)  →  2. Tổng thanh toán (DSTT.OTC)  →  3. Doanh số bán</w:t>
       </w:r>
     </w:p>
     <w:p>
@@ -2885,7 +2811,7 @@
           <w:rFonts w:ascii="Arial" w:hAnsi="Arial"/>
           <w:sz w:val="20"/>
         </w:rPr>
-        <w:t>1. Xuất báo cáo PDF / Excel từ trang Dashboard</w:t>
+        <w:t>1. Xuất báo cáo PDF / Excel từ Dashboard</w:t>
       </w:r>
     </w:p>
     <w:p>
@@ -2899,7 +2825,7 @@
           <w:rFonts w:ascii="Arial" w:hAnsi="Arial"/>
           <w:sz w:val="20"/>
         </w:rPr>
-        <w:t>2. So sánh nhiều tháng (tháng này vs tháng trước, cùng kỳ năm trước)</w:t>
+        <w:t>2. So sánh nhiều tháng (tháng này vs tháng trước, cùng kỳ năm ngoái)</w:t>
       </w:r>
     </w:p>
     <w:p>
@@ -2913,7 +2839,7 @@
           <w:rFonts w:ascii="Arial" w:hAnsi="Arial"/>
           <w:sz w:val="20"/>
         </w:rPr>
-        <w:t>3. Cảnh báo (Alert) khi TDV đạt dưới 70% chỉ tiêu</w:t>
+        <w:t>3. Alert khi TDV đạt dưới 70% chỉ tiêu</w:t>
       </w:r>
     </w:p>
     <w:p>
@@ -2927,7 +2853,7 @@
           <w:rFonts w:ascii="Arial" w:hAnsi="Arial"/>
           <w:sz w:val="20"/>
         </w:rPr>
-        <w:t>4. Deploy online: Vercel (frontend) + Railway (backend) khi cần nhiều máy truy cập</w:t>
+        <w:t>4. Deploy online: Vercel (frontend) + Railway (backend)</w:t>
       </w:r>
     </w:p>
     <w:p>
@@ -2941,7 +2867,7 @@
           <w:rFonts w:ascii="Arial" w:hAnsi="Arial"/>
           <w:sz w:val="20"/>
         </w:rPr>
-        <w:t>5. Tích hợp tự động đọc file từ OneDrive / Google Drive</w:t>
+        <w:t>5. Tích hợp tự động từ OneDrive / Google Drive</w:t>
       </w:r>
     </w:p>
     <w:p>
@@ -2955,7 +2881,7 @@
           <w:rFonts w:ascii="Arial" w:hAnsi="Arial"/>
           <w:sz w:val="20"/>
         </w:rPr>
-        <w:t>6. Thêm biểu đồ xu hướng doanh số qua các tháng (line chart)</w:t>
+        <w:t>6. Biểu đồ xu hướng DS qua các tháng (line chart)</w:t>
       </w:r>
     </w:p>
     <w:p>
@@ -2969,7 +2895,7 @@
           <w:rFonts w:ascii="Arial" w:hAnsi="Arial"/>
           <w:sz w:val="20"/>
         </w:rPr>
-        <w:t>7. Bật lại tính năng đăng nhập + phân quyền DSM/TDV xem đúng phần của mình</w:t>
+        <w:t>7. Bật tính năng đăng nhập + phân quyền DSM/TDV</w:t>
       </w:r>
     </w:p>
     <w:p>
@@ -3068,7 +2994,7 @@
                 <w:rFonts w:ascii="Arial" w:hAnsi="Arial"/>
                 <w:sz w:val="18"/>
               </w:rPr>
-              <w:t>"Cannot connect to server"</w:t>
+              <w:t>Cannot connect to server</w:t>
             </w:r>
           </w:p>
         </w:tc>
@@ -3116,7 +3042,7 @@
                 <w:rFonts w:ascii="Arial" w:hAnsi="Arial"/>
                 <w:sz w:val="18"/>
               </w:rPr>
-              <w:t>Dữ liệu trắng sau khi upload</w:t>
+              <w:t>Dữ liệu trắng sau upload</w:t>
             </w:r>
           </w:p>
         </w:tc>
@@ -3132,7 +3058,7 @@
                 <w:rFonts w:ascii="Arial" w:hAnsi="Arial"/>
                 <w:sz w:val="18"/>
               </w:rPr>
-              <w:t>File Excel không có đúng tên sheet</w:t>
+              <w:t>Sai sheet name trong Excel</w:t>
             </w:r>
           </w:p>
         </w:tc>
@@ -3148,7 +3074,7 @@
                 <w:rFonts w:ascii="Arial" w:hAnsi="Arial"/>
                 <w:sz w:val="18"/>
               </w:rPr>
-              <w:t>Kiểm tra có sheet 'Chỉ tiêu SPTT' hoặc 'Sổ Chi Tiết Bán Hàng'</w:t>
+              <w:t>Cần có sheet "Chỉ tiêu SPTT" hoặc "Sổ Chi Tiết Bán Hàng"</w:t>
             </w:r>
           </w:p>
         </w:tc>
@@ -3165,7 +3091,7 @@
                 <w:rFonts w:ascii="Arial" w:hAnsi="Arial"/>
                 <w:sz w:val="18"/>
               </w:rPr>
-              <w:t>% HT = 0% cho tất cả DSM</w:t>
+              <w:t>% HT = 0% toàn bộ</w:t>
             </w:r>
           </w:p>
         </w:tc>
@@ -3195,7 +3121,7 @@
                 <w:rFonts w:ascii="Arial" w:hAnsi="Arial"/>
                 <w:sz w:val="18"/>
               </w:rPr>
-              <w:t>Upload CHỈ TIÊU SPTT.xlsx trước khi xem dashboard</w:t>
+              <w:t>Upload CHỈ TIÊU SPTT.xlsx trước</w:t>
             </w:r>
           </w:p>
         </w:tc>
@@ -3213,7 +3139,7 @@
                 <w:rFonts w:ascii="Arial" w:hAnsi="Arial"/>
                 <w:sz w:val="18"/>
               </w:rPr>
-              <w:t>Mục tiêu bị nhân 3 lần</w:t>
+              <w:t>Mục tiêu bị nhân 3x</w:t>
             </w:r>
           </w:p>
         </w:tc>
@@ -3229,7 +3155,7 @@
                 <w:rFonts w:ascii="Arial" w:hAnsi="Arial"/>
                 <w:sz w:val="18"/>
               </w:rPr>
-              <w:t>Server cũ vẫn đang chạy song song</w:t>
+              <w:t>Server cũ vẫn chạy</w:t>
             </w:r>
           </w:p>
         </w:tc>
@@ -3245,7 +3171,7 @@
                 <w:rFonts w:ascii="Arial" w:hAnsi="Arial"/>
                 <w:sz w:val="18"/>
               </w:rPr>
-              <w:t>Kill process port 3001 rồi restart</w:t>
+              <w:t>Kill port 3001 rồi restart</w:t>
             </w:r>
           </w:p>
         </w:tc>
@@ -3262,7 +3188,7 @@
                 <w:rFonts w:ascii="Arial" w:hAnsi="Arial"/>
                 <w:sz w:val="18"/>
               </w:rPr>
-              <w:t>Port 3001/5173 đã được dùng</w:t>
+              <w:t>Tháng khác không có dữ liệu</w:t>
             </w:r>
           </w:p>
         </w:tc>
@@ -3277,7 +3203,7 @@
                 <w:rFonts w:ascii="Arial" w:hAnsi="Arial"/>
                 <w:sz w:val="18"/>
               </w:rPr>
-              <w:t>Ứng dụng khác chiếm port</w:t>
+              <w:t>File upload cũ (1 tháng)</w:t>
             </w:r>
           </w:p>
         </w:tc>
@@ -3292,7 +3218,57 @@
                 <w:rFonts w:ascii="Arial" w:hAnsi="Arial"/>
                 <w:sz w:val="18"/>
               </w:rPr>
-              <w:t>Đổi PORT trong server.js và/hoặc vite.config.js</w:t>
+              <w:t>Upload lại file chỉ tiêu — tự parse 12 tháng</w:t>
+            </w:r>
+          </w:p>
+        </w:tc>
+      </w:tr>
+      <w:tr>
+        <w:tc>
+          <w:tcPr>
+            <w:tcW w:type="dxa" w:w="2551"/>
+            <w:shd w:val="clear" w:color="auto" w:fill="E8F0FB"/>
+          </w:tcPr>
+          <w:p>
+            <w:r/>
+            <w:r>
+              <w:rPr>
+                <w:rFonts w:ascii="Arial" w:hAnsi="Arial"/>
+                <w:sz w:val="18"/>
+              </w:rPr>
+              <w:t>Port 3001/5173 bị chiếm</w:t>
+            </w:r>
+          </w:p>
+        </w:tc>
+        <w:tc>
+          <w:tcPr>
+            <w:tcW w:type="dxa" w:w="2551"/>
+            <w:shd w:val="clear" w:color="auto" w:fill="E8F0FB"/>
+          </w:tcPr>
+          <w:p>
+            <w:r/>
+            <w:r>
+              <w:rPr>
+                <w:rFonts w:ascii="Arial" w:hAnsi="Arial"/>
+                <w:sz w:val="18"/>
+              </w:rPr>
+              <w:t>App khác đang dùng</w:t>
+            </w:r>
+          </w:p>
+        </w:tc>
+        <w:tc>
+          <w:tcPr>
+            <w:tcW w:type="dxa" w:w="3969"/>
+            <w:shd w:val="clear" w:color="auto" w:fill="E8F0FB"/>
+          </w:tcPr>
+          <w:p>
+            <w:r/>
+            <w:r>
+              <w:rPr>
+                <w:rFonts w:ascii="Arial" w:hAnsi="Arial"/>
+                <w:sz w:val="18"/>
+              </w:rPr>
+              <w:t>Đổi PORT trong server.js và vite.config.js</w:t>
             </w:r>
           </w:p>
         </w:tc>
@@ -3312,7 +3288,7 @@
           <w:color w:val="AAAAAA"/>
           <w:sz w:val="18"/>
         </w:rPr>
-        <w:t>Tài liệu được tạo bởi Claude Code  —  Tháng 6/2026</w:t>
+        <w:t>Tài liệu bàn giao — Claude Code  ·  Tháng 6/2026  ·  github.com/namlhwork84/kpi-otc-dashboard</w:t>
       </w:r>
     </w:p>
     <w:sectPr>

</xml_diff>